<commit_message>
docs: explicita melhorias no roteiro .docx (secao de melhorias + marcadores [NOVO])
</commit_message>
<xml_diff>
--- a/docs/Roteiro_de_Teste_Primeiro_Emplacamento.docx
+++ b/docs/Roteiro_de_Teste_Primeiro_Emplacamento.docx
@@ -36,6 +36,117 @@
           <w:color w:val="666666"/>
         </w:rPr>
         <w:t>Prodesp / DETRAN-SP  |  BRQ Digital Solutions</w:t>
+      </w:r>
+    </w:p>
+    <w:p>
+      <w:pPr>
+        <w:spacing w:before="240" w:after="120"/>
+      </w:pPr>
+      <w:r>
+        <w:rPr>
+          <w:b/>
+          <w:color w:val="1A1A1A"/>
+          <w:sz w:val="26"/>
+        </w:rPr>
+        <w:t>Melhorias aplicadas nesta revisao</w:t>
+      </w:r>
+    </w:p>
+    <w:p>
+      <w:r>
+        <w:t>Este roteiro parte dos documentos originais entregues pela Prodesp (descricao do fluxo com prints de tela) e foi revisado para o formato de roteiro de teste executavel. As melhorias abaixo foram aplicadas:</w:t>
+      </w:r>
+    </w:p>
+    <w:p>
+      <w:pPr>
+        <w:pStyle w:val="ListBullet"/>
+      </w:pPr>
+      <w:r>
+        <w:rPr>
+          <w:b/>
+        </w:rPr>
+        <w:t xml:space="preserve">Resultado esperado por passo: </w:t>
+      </w:r>
+      <w:r>
+        <w:t>Cada passo agora tem um criterio verificavel de aprovacao (antes o original apenas descrevia o que acontecia, sem formalizar o esperado).</w:t>
+      </w:r>
+    </w:p>
+    <w:p>
+      <w:pPr>
+        <w:pStyle w:val="ListBullet"/>
+      </w:pPr>
+      <w:r>
+        <w:rPr>
+          <w:b/>
+        </w:rPr>
+        <w:t xml:space="preserve">Separacao por camada: </w:t>
+      </w:r>
+      <w:r>
+        <w:t>Coluna "Camada" distingue acao no eCRV (portal web), transacao no mainframe ou dependencia externa (BIN/Serpro) - o original misturava as camadas.</w:t>
+      </w:r>
+    </w:p>
+    <w:p>
+      <w:pPr>
+        <w:pStyle w:val="ListBullet"/>
+      </w:pPr>
+      <w:r>
+        <w:rPr>
+          <w:b/>
+        </w:rPr>
+        <w:t xml:space="preserve">Correcao de fidelidade (aprovacao x situacao): </w:t>
+      </w:r>
+      <w:r>
+        <w:t>A aprovacao da ficha (SALVAR) foi separada da confirmacao da mudanca de situacao 1-&gt;5 (PGER); no original apareciam fundidas em um unico passo.</w:t>
+      </w:r>
+    </w:p>
+    <w:p>
+      <w:pPr>
+        <w:pStyle w:val="ListBullet"/>
+      </w:pPr>
+      <w:r>
+        <w:rPr>
+          <w:b/>
+        </w:rPr>
+        <w:t xml:space="preserve">Passo de excecao isolado: </w:t>
+      </w:r>
+      <w:r>
+        <w:t>O cancelamento de estampagem (PEST/CEST) foi destacado como caminho alternativo.</w:t>
+      </w:r>
+    </w:p>
+    <w:p>
+      <w:pPr>
+        <w:pStyle w:val="ListBullet"/>
+      </w:pPr>
+      <w:r>
+        <w:rPr>
+          <w:b/>
+        </w:rPr>
+        <w:t xml:space="preserve">Detalhamento do CNPJ oficial: </w:t>
+      </w:r>
+      <w:r>
+        <w:t>A transacao "PJOF" foi detalhada como duas telas reais (PJO1 menu e PJO2 inclusao), com categoria M/E/U, conforme observado nos prints.</w:t>
+      </w:r>
+    </w:p>
+    <w:p>
+      <w:pPr>
+        <w:pStyle w:val="ListBullet"/>
+      </w:pPr>
+      <w:r>
+        <w:rPr>
+          <w:b/>
+        </w:rPr>
+        <w:t xml:space="preserve">Rastreabilidade e dados reais: </w:t>
+      </w:r>
+      <w:r>
+        <w:t>Telas mainframe identificadas (PER1, TXUT, CAV2, PGE4, DUT1, CDAV) e dados confirmados nos prints (STATUS REG 05, placas, RENAVAM, CRV).</w:t>
+      </w:r>
+    </w:p>
+    <w:p>
+      <w:r>
+        <w:rPr>
+          <w:i/>
+          <w:color w:val="666666"/>
+        </w:rPr>
+        <w:t>Observacao: os itens marcados com [NOVO] nas tabelas de passos (colunas Camada e Resultado esperado) sao adicoes desta revisao.</w:t>
       </w:r>
     </w:p>
     <w:p>
@@ -642,7 +753,7 @@
           </w:tcPr>
           <w:p>
             <w:r>
-              <w:t>Camada</w:t>
+              <w:t>Camada [NOVO]</w:t>
             </w:r>
           </w:p>
         </w:tc>
@@ -662,7 +773,7 @@
           </w:tcPr>
           <w:p>
             <w:r>
-              <w:t>Resultado esperado</w:t>
+              <w:t>Resultado esperado [NOVO]</w:t>
             </w:r>
           </w:p>
         </w:tc>
@@ -1608,7 +1719,7 @@
           </w:tcPr>
           <w:p>
             <w:r>
-              <w:t>Camada</w:t>
+              <w:t>Camada [NOVO]</w:t>
             </w:r>
           </w:p>
         </w:tc>
@@ -1628,7 +1739,7 @@
           </w:tcPr>
           <w:p>
             <w:r>
-              <w:t>Resultado esperado</w:t>
+              <w:t>Resultado esperado [NOVO]</w:t>
             </w:r>
           </w:p>
         </w:tc>
@@ -2574,7 +2685,7 @@
           </w:tcPr>
           <w:p>
             <w:r>
-              <w:t>Camada</w:t>
+              <w:t>Camada [NOVO]</w:t>
             </w:r>
           </w:p>
         </w:tc>
@@ -2594,7 +2705,7 @@
           </w:tcPr>
           <w:p>
             <w:r>
-              <w:t>Resultado esperado</w:t>
+              <w:t>Resultado esperado [NOVO]</w:t>
             </w:r>
           </w:p>
         </w:tc>

</xml_diff>